<commit_message>
Roteiro Roberto Müller: revisão da parte 3
Co-Authored-By: Claude Opus 5.5 <noreply@anthropic.com>
Claude-Session: https://claude.ai/code/session_01MJjUEEZrxQDEUifKK2vj9g
</commit_message>
<xml_diff>
--- a/roteiros/roberto-muller/RobertoMuller_Parte3.docx
+++ b/roteiros/roberto-muller/RobertoMuller_Parte3.docx
@@ -303,6 +303,30 @@
         <w:rPr>
           <w:color w:val="000000"/>
         </w:rPr>
+        <w:t>Com a saúde fragilizada, subir num palco ficava cada vez mais difícil. E um homem doente, já perto dos oitenta anos, precisa de remédios e de cuidado todos os dias.</w:t>
+      </w:r>
+    </w:p>
+    <w:p>
+      <w:r>
+        <w:rPr>
+          <w:color w:val="000000"/>
+        </w:rPr>
+        <w:t>E ao lado dele, no Recife, estava Dagmar.</w:t>
+      </w:r>
+    </w:p>
+    <w:p>
+      <w:r>
+        <w:rPr>
+          <w:color w:val="000000"/>
+        </w:rPr>
+        <w:t>A companheira que passaria esses anos cuidando de um homem que já não conseguia cuidar de si mesmo.</w:t>
+      </w:r>
+    </w:p>
+    <w:p>
+      <w:r>
+        <w:rPr>
+          <w:color w:val="000000"/>
+        </w:rPr>
         <w:t>E então veio um golpe que ninguém previu. Nem ele, nem o Brasil.</w:t>
       </w:r>
     </w:p>
@@ -319,7 +343,7 @@
         <w:rPr>
           <w:color w:val="000000"/>
         </w:rPr>
-        <w:t>Da noite para o dia, os palcos do país inteiro fecharam. Shows cancelados, festas proibidas, clubes de portas fechadas. Para os artistas mais jovens, foi um período duro. Para um cantor de oitenta e três anos, com a saúde frágil e que dependia de apresentações, foi devastador.</w:t>
+        <w:t>Da noite para o dia, os palcos do país inteiro fecharam. Shows foram cancelados e as festas, proibidas. Para os artistas mais jovens, foi um período duro. Para um cantor de oitenta e três anos, com a saúde frágil e que dependia de apresentações, foi devastador.</w:t>
       </w:r>
     </w:p>
     <w:p>
@@ -357,33 +381,9 @@
     <w:p>
       <w:r>
         <w:rPr>
-          <w:color w:val="000000"/>
-        </w:rPr>
-        <w:t>Com a saúde fragilizada, subir num palco ficava cada vez mais difícil. E um homem doente, com mais de setenta e cinco anos, precisa de remédios e de cuidado todos os dias.</w:t>
-      </w:r>
-    </w:p>
-    <w:p>
-      <w:r>
-        <w:rPr>
-          <w:color w:val="000000"/>
-        </w:rPr>
-        <w:t>E ao lado dele, no Recife, estava Dagmar.</w:t>
-      </w:r>
-    </w:p>
-    <w:p>
-      <w:r>
-        <w:rPr>
-          <w:color w:val="000000"/>
-        </w:rPr>
-        <w:t>A companheira que passaria esses anos cuidando de um homem que já não conseguia cuidar de si mesmo.</w:t>
-      </w:r>
-    </w:p>
-    <w:p>
-      <w:r>
-        <w:rPr>
           <w:color w:val="C00000"/>
         </w:rPr>
-        <w:t>Imagine por um momento que fosse o seu pai. Um homem que já foi ouvido pelo Brasil inteiro, que já apareceu na televisão ao lado do Chacrinha, que já recebeu seis discos de ouro. E que agora depende de alguém para levantar da cama.</w:t>
+        <w:t>Imagine por um momento que fosse o seu pai. Um homem que já foi ouvido pelo Brasil inteiro e recebeu seis discos de ouro. E que agora depende de alguém para levantar da cama.</w:t>
       </w:r>
     </w:p>
     <w:p>
@@ -455,7 +455,7 @@
         <w:rPr>
           <w:color w:val="000000"/>
         </w:rPr>
-        <w:t>Os comentários se encheram de carinho. Gente agradecendo, gente desejando vida longa ao rei, gente lembrando de shows antigos.</w:t>
+        <w:t>Os comentários se encheram de carinho. Gente agradecendo e desejando vida longa ao rei.</w:t>
       </w:r>
     </w:p>
     <w:p>
@@ -519,15 +519,7 @@
         <w:rPr>
           <w:color w:val="000000"/>
         </w:rPr>
-        <w:t>Mas, três dias antes do aniversário, no dia catorze de fevereiro, o nome dele apareceu numa notícia que nenhum fã queria ler.</w:t>
-      </w:r>
-    </w:p>
-    <w:p>
-      <w:r>
-        <w:rPr>
-          <w:color w:val="000000"/>
-        </w:rPr>
-        <w:t>E naquele mês, um vídeo gravado pelo cantor Tarcys Andrade começou a ser compartilhado em grupos de mensagens e em portais de notícia do interior do Piauí.</w:t>
+        <w:t>Naquele mês, um vídeo gravado pelo cantor Tarcys Andrade começou a ser compartilhado em grupos de mensagens e em portais de notícia do interior do Piauí.</w:t>
       </w:r>
     </w:p>
     <w:p>
@@ -551,7 +543,7 @@
         <w:rPr>
           <w:color w:val="000000"/>
         </w:rPr>
-        <w:t>A notícia chegou até Luzilândia, uma cidade do norte do Piauí onde Roberto já tinha feito show. E foi lá que um portal local publicou uma manchete que resume tudo. O cantor, conhecido nacionalmente, passava por necessidades e pedia ajuda.</w:t>
+        <w:t>A notícia chegou até Luzilândia, uma cidade do norte do Piauí onde Roberto já tinha feito show. E foi lá que, no dia catorze de fevereiro, três dias antes do aniversário dele, um portal local publicou uma manchete que resume tudo. O cantor, conhecido nacionalmente, passava por necessidades e pedia ajuda.</w:t>
       </w:r>
     </w:p>
     <w:p>
@@ -623,7 +615,7 @@
         <w:rPr>
           <w:color w:val="1F4EB4"/>
         </w:rPr>
-        <w:t>Foi isso que o Brasil não viu. Enquanto as músicas dele continuavam tocando nas rádios de saudade, nos bares do interior e nos canais de internet com milhões de visualizações, o homem por trás daquela voz passava por necessidades numa casa no Recife.</w:t>
+        <w:t>Foi isso que o Brasil não viu. Enquanto as músicas dele continuavam tocando nas rádios de saudade e em vídeos da internet com milhões de visualizações, o homem por trás daquela voz passava por necessidades numa casa no Recife.</w:t>
       </w:r>
     </w:p>
     <w:p>

</xml_diff>

<commit_message>
Roteiro Roberto Müller: ajuste de microganchos na parte 3
Co-Authored-By: Claude Opus 5.5 <noreply@anthropic.com>
Claude-Session: https://claude.ai/code/session_01MJjUEEZrxQDEUifKK2vj9g
</commit_message>
<xml_diff>
--- a/roteiros/roberto-muller/RobertoMuller_Parte3.docx
+++ b/roteiros/roberto-muller/RobertoMuller_Parte3.docx
@@ -319,7 +319,7 @@
         <w:rPr>
           <w:color w:val="000000"/>
         </w:rPr>
-        <w:t>A companheira que passaria esses anos cuidando de um homem que já não conseguia cuidar de si mesmo.</w:t>
+        <w:t>A companheira que estaria ao lado dele em cada um dos anos difíceis que vinham pela frente.</w:t>
       </w:r>
     </w:p>
     <w:p>
@@ -381,14 +381,6 @@
     <w:p>
       <w:r>
         <w:rPr>
-          <w:color w:val="C00000"/>
-        </w:rPr>
-        <w:t>Imagine por um momento que fosse o seu pai. Um homem que já foi ouvido pelo Brasil inteiro e recebeu seis discos de ouro. E que agora depende de alguém para levantar da cama.</w:t>
-      </w:r>
-    </w:p>
-    <w:p>
-      <w:r>
-        <w:rPr>
           <w:color w:val="000000"/>
         </w:rPr>
         <w:t>Um novo AVC atingiu Roberto.</w:t>
@@ -408,6 +400,14 @@
           <w:color w:val="000000"/>
         </w:rPr>
         <w:t>O homem que subia nos palcos como um lorde, de terno colorido e cabelo impecável, agora precisava ser levado de um cômodo para outro.</w:t>
+      </w:r>
+    </w:p>
+    <w:p>
+      <w:r>
+        <w:rPr>
+          <w:color w:val="C00000"/>
+        </w:rPr>
+        <w:t>Imagine por um momento que fosse o seu pai. Um homem que já foi ouvido pelo Brasil inteiro e recebeu seis discos de ouro. E que agora depende de alguém para levantar da cama.</w:t>
       </w:r>
     </w:p>
     <w:p>

</xml_diff>